<commit_message>
doc: add hw1 content for `Problem Statement` but not finish
</commit_message>
<xml_diff>
--- a/document/hw1.docx
+++ b/document/hw1.docx
@@ -2,7 +2,122 @@
 <file path=word/document.xml><?xml version="1.0" encoding="utf-8"?>
 <w:document xmlns:wpc="http://schemas.microsoft.com/office/word/2010/wordprocessingCanvas" xmlns:cx="http://schemas.microsoft.com/office/drawing/2014/chartex" xmlns:cx1="http://schemas.microsoft.com/office/drawing/2015/9/8/chartex" xmlns:cx2="http://schemas.microsoft.com/office/drawing/2015/10/21/chartex" xmlns:cx3="http://schemas.microsoft.com/office/drawing/2016/5/9/chartex" xmlns:cx4="http://schemas.microsoft.com/office/drawing/2016/5/10/chartex" xmlns:cx5="http://schemas.microsoft.com/office/drawing/2016/5/11/chartex" xmlns:cx6="http://schemas.microsoft.com/office/drawing/2016/5/12/chartex" xmlns:cx7="http://schemas.microsoft.com/office/drawing/2016/5/13/chartex" xmlns:cx8="http://schemas.microsoft.com/office/drawing/2016/5/14/chartex" xmlns:mc="http://schemas.openxmlformats.org/markup-compatibility/2006" xmlns:aink="http://schemas.microsoft.com/office/drawing/2016/ink" xmlns:am3d="http://schemas.microsoft.com/office/drawing/2017/model3d" xmlns:o="urn:schemas-microsoft-com:office:office" xmlns:oel="http://schemas.microsoft.com/office/2019/extlst" xmlns:r="http://schemas.openxmlformats.org/officeDocument/2006/relationships" xmlns:m="http://schemas.openxmlformats.org/officeDocument/2006/math" xmlns:v="urn:schemas-microsoft-com:vml" xmlns:wp14="http://schemas.microsoft.com/office/word/2010/wordprocessingDrawing" xmlns:wp="http://schemas.openxmlformats.org/drawingml/2006/wordprocessingDrawing" xmlns:w10="urn:schemas-microsoft-com:office:word" xmlns:w="http://schemas.openxmlformats.org/wordprocessingml/2006/main" xmlns:w14="http://schemas.microsoft.com/office/word/2010/wordml" xmlns:w15="http://schemas.microsoft.com/office/word/2012/wordml" xmlns:w16cex="http://schemas.microsoft.com/office/word/2018/wordml/cex" xmlns:w16cid="http://schemas.microsoft.com/office/word/2016/wordml/cid" xmlns:w16="http://schemas.microsoft.com/office/word/2018/wordml" xmlns:w16du="http://schemas.microsoft.com/office/word/2023/wordml/word16du" xmlns:w16sdtdh="http://schemas.microsoft.com/office/word/2020/wordml/sdtdatahash" xmlns:w16sdtfl="http://schemas.microsoft.com/office/word/2024/wordml/sdtformatlock" xmlns:w16se="http://schemas.microsoft.com/office/word/2015/wordml/symex" xmlns:wpg="http://schemas.microsoft.com/office/word/2010/wordprocessingGroup" xmlns:wpi="http://schemas.microsoft.com/office/word/2010/wordprocessingInk" xmlns:wne="http://schemas.microsoft.com/office/word/2006/wordml" xmlns:wps="http://schemas.microsoft.com/office/word/2010/wordprocessingShape" mc:Ignorable="w14 w15 w16se w16cid w16 w16cex w16sdtdh w16sdtfl w16du wp14">
   <w:body>
-    <w:p/>
+    <w:p>
+      <w:r>
+        <w:rPr>
+          <w:rFonts w:hint="eastAsia"/>
+        </w:rPr>
+        <w:t>二手書平台</w:t>
+      </w:r>
+    </w:p>
+    <w:p>
+      <w:r>
+        <w:t>HW1</w:t>
+      </w:r>
+    </w:p>
+    <w:p>
+      <w:r>
+        <w:t xml:space="preserve">113598037 </w:t>
+      </w:r>
+      <w:r>
+        <w:rPr>
+          <w:rFonts w:hint="eastAsia"/>
+        </w:rPr>
+        <w:t>陳宥錡</w:t>
+      </w:r>
+    </w:p>
+    <w:p>
+      <w:r>
+        <w:t xml:space="preserve">114598003 </w:t>
+      </w:r>
+      <w:r>
+        <w:rPr>
+          <w:rFonts w:hint="eastAsia"/>
+        </w:rPr>
+        <w:t>許芷菱</w:t>
+      </w:r>
+    </w:p>
+    <w:p>
+      <w:pPr>
+        <w:rPr>
+          <w:rFonts w:hint="eastAsia"/>
+        </w:rPr>
+      </w:pPr>
+      <w:r>
+        <w:t>Problem Statement</w:t>
+      </w:r>
+    </w:p>
+    <w:p>
+      <w:r>
+        <w:rPr>
+          <w:rFonts w:hint="eastAsia"/>
+        </w:rPr>
+        <w:t>學生時期總是會因為課程需要，購入與課程相關的書籍。有些可能是上課指定的英文原文書，有些可能是寫得不錯、可用當作輔助的書籍。但這些書往往在我們修完當學期課程後，便被我們遺落在書櫃的一角，很難會有再去翻閱的機會。有些人會選擇在新的學期後贈與自己熟識的學弟妹，但更多可能會是放在角落生灰塵，直到家裡進行大掃除的時候才會清理。</w:t>
+      </w:r>
+    </w:p>
+    <w:p>
+      <w:pPr>
+        <w:rPr>
+          <w:rFonts w:hint="eastAsia"/>
+        </w:rPr>
+      </w:pPr>
+      <w:r>
+        <w:rPr>
+          <w:rFonts w:hint="eastAsia"/>
+        </w:rPr>
+        <w:t>我們推出的</w:t>
+      </w:r>
+      <w:proofErr w:type="spellStart"/>
+      <w:r>
+        <w:t>Re</w:t>
+      </w:r>
+      <w:r>
+        <w:t>:Book</w:t>
+      </w:r>
+      <w:proofErr w:type="spellEnd"/>
+      <w:r>
+        <w:rPr>
+          <w:rFonts w:hint="eastAsia"/>
+        </w:rPr>
+        <w:t>二手書平台</w:t>
+      </w:r>
+      <w:r>
+        <w:rPr>
+          <w:rFonts w:hint="eastAsia"/>
+        </w:rPr>
+        <w:t>，致力於為書本尋找下一個屬於它生命的意義。使用者可以透過書名、作者、出版社或是</w:t>
+      </w:r>
+      <w:r>
+        <w:t>ISBN</w:t>
+      </w:r>
+      <w:r>
+        <w:rPr>
+          <w:rFonts w:hint="eastAsia"/>
+        </w:rPr>
+        <w:t>碼，搜尋平台上是否有等待被二手交易的書籍。使用者能針對自己要販售的書籍給予期望的二手價，也能跟顧客透過平台提供的私訊功能協商最終的價格</w:t>
+      </w:r>
+    </w:p>
+    <w:p>
+      <w:r>
+        <w:t>The Development Language</w:t>
+      </w:r>
+    </w:p>
+    <w:p>
+      <w:r>
+        <w:rPr>
+          <w:rFonts w:hint="eastAsia"/>
+        </w:rPr>
+        <w:t>後端使用</w:t>
+      </w:r>
+      <w:r>
+        <w:t>Java</w:t>
+      </w:r>
+    </w:p>
+    <w:p>
+      <w:r>
+        <w:t>Measurement</w:t>
+      </w:r>
+    </w:p>
     <w:sectPr>
       <w:pgSz w:w="11906" w:h="16838"/>
       <w:pgMar w:top="1440" w:right="1800" w:bottom="1440" w:left="1800" w:header="851" w:footer="992" w:gutter="0"/>

</xml_diff>

<commit_message>
doc: revise hw1 content for `Problem Statement`
</commit_message>
<xml_diff>
--- a/document/hw1.docx
+++ b/document/hw1.docx
@@ -38,21 +38,8 @@
       </w:r>
     </w:p>
     <w:p>
-      <w:pPr>
-        <w:rPr>
-          <w:rFonts w:hint="eastAsia"/>
-        </w:rPr>
-      </w:pPr>
       <w:r>
         <w:t>Problem Statement</w:t>
-      </w:r>
-    </w:p>
-    <w:p>
-      <w:r>
-        <w:rPr>
-          <w:rFonts w:hint="eastAsia"/>
-        </w:rPr>
-        <w:t>學生時期總是會因為課程需要，購入與課程相關的書籍。有些可能是上課指定的英文原文書，有些可能是寫得不錯、可用當作輔助的書籍。但這些書往往在我們修完當學期課程後，便被我們遺落在書櫃的一角，很難會有再去翻閱的機會。有些人會選擇在新的學期後贈與自己熟識的學弟妹，但更多可能會是放在角落生灰塵，直到家裡進行大掃除的時候才會清理。</w:t>
       </w:r>
     </w:p>
     <w:p>
@@ -61,56 +48,112 @@
           <w:rFonts w:hint="eastAsia"/>
         </w:rPr>
       </w:pPr>
-      <w:r>
-        <w:rPr>
-          <w:rFonts w:hint="eastAsia"/>
-        </w:rPr>
-        <w:t>我們推出的</w:t>
-      </w:r>
       <w:proofErr w:type="spellStart"/>
       <w:r>
-        <w:t>Re</w:t>
-      </w:r>
-      <w:r>
-        <w:t>:Book</w:t>
+        <w:rPr>
+          <w:rFonts w:hint="eastAsia"/>
+        </w:rPr>
+        <w:t>Re:Book</w:t>
       </w:r>
       <w:proofErr w:type="spellEnd"/>
       <w:r>
         <w:rPr>
           <w:rFonts w:hint="eastAsia"/>
         </w:rPr>
-        <w:t>二手書平台</w:t>
-      </w:r>
-      <w:r>
-        <w:rPr>
-          <w:rFonts w:hint="eastAsia"/>
-        </w:rPr>
-        <w:t>，致力於為書本尋找下一個屬於它生命的意義。使用者可以透過書名、作者、出版社或是</w:t>
-      </w:r>
-      <w:r>
-        <w:t>ISBN</w:t>
-      </w:r>
-      <w:r>
-        <w:rPr>
-          <w:rFonts w:hint="eastAsia"/>
-        </w:rPr>
-        <w:t>碼，搜尋平台上是否有等待被二手交易的書籍。使用者能針對自己要販售的書籍給予期望的二手價，也能跟顧客透過平台提供的私訊功能協商最終的價格</w:t>
+        <w:t>：賦予知識第二次生命</w:t>
       </w:r>
     </w:p>
     <w:p>
       <w:r>
-        <w:t>The Development Language</w:t>
+        <w:rPr>
+          <w:rFonts w:hint="eastAsia"/>
+        </w:rPr>
+        <w:t>每個學期，學生們都會為了課程購入大量的專業教科書或英文原文書。雖然這些書在學期中不可或缺，但往往在期末考結束後，便被遺忘在書架上某個佈滿灰塵的角落。這些本該繼續啟發他人的知識結晶，經常在畢業大掃除或搬家前被冷落。雖然有些學生會將書贈與熟識的學弟妹，但更多寶貴的資源就在無形中被浪費了。</w:t>
       </w:r>
     </w:p>
     <w:p>
-      <w:r>
-        <w:rPr>
-          <w:rFonts w:hint="eastAsia"/>
-        </w:rPr>
-        <w:t>後端使用</w:t>
+      <w:proofErr w:type="spellStart"/>
+      <w:r>
+        <w:rPr>
+          <w:rFonts w:hint="eastAsia"/>
+        </w:rPr>
+        <w:t>Re:Book</w:t>
+      </w:r>
+      <w:proofErr w:type="spellEnd"/>
+      <w:r>
+        <w:rPr>
+          <w:rFonts w:hint="eastAsia"/>
+        </w:rPr>
+        <w:t xml:space="preserve"> </w:t>
+      </w:r>
+      <w:r>
+        <w:rPr>
+          <w:rFonts w:hint="eastAsia"/>
+        </w:rPr>
+        <w:t>是一款專為學生與求知者打造的應用程式，旨在解決資源停滯與學術教材成本過高的問題。它在校園社群與學生網路群組之間架起橋樑，特別是在學期交替之際，當教材需求量最高的時候。我們深信這個平台是必要的，因為每一本書都值得擁有尋找下一個生命意義的機會，而不是淪為廢棄物。</w:t>
+      </w:r>
+    </w:p>
+    <w:p>
+      <w:proofErr w:type="spellStart"/>
+      <w:r>
+        <w:t>Re:Book</w:t>
+      </w:r>
+      <w:proofErr w:type="spellEnd"/>
+      <w:r>
+        <w:rPr>
+          <w:rFonts w:hint="eastAsia"/>
+        </w:rPr>
+        <w:t>透過直觀的交換系統為二手書注入新生命。賣家可以輸入書名、作者、出版社或</w:t>
+      </w:r>
+      <w:r>
+        <w:rPr>
+          <w:rFonts w:hint="eastAsia"/>
+        </w:rPr>
+        <w:t xml:space="preserve"> ISBN </w:t>
+      </w:r>
+      <w:r>
+        <w:rPr>
+          <w:rFonts w:hint="eastAsia"/>
+        </w:rPr>
+        <w:t>來上架書籍，讓系統對現有知識進行分類。為了尊重書本的價值，賣家可以設定期望價格，並分享書籍狀況的照片或故事。潛在買家則能利用搜尋與篩選功能找到下一本必讀讀物。最後，</w:t>
+      </w:r>
+      <w:r>
+        <w:rPr>
+          <w:rFonts w:hint="eastAsia"/>
+        </w:rPr>
+        <w:t>提供</w:t>
+      </w:r>
+      <w:r>
+        <w:rPr>
+          <w:rFonts w:hint="eastAsia"/>
+        </w:rPr>
+        <w:t>私訊功能讓使用者能協商最終價格並協調交付方式，確保知識的傳遞是具有人情味且順暢的。</w:t>
+      </w:r>
+    </w:p>
+    <w:p>
+      <w:r>
+        <w:t>The Development Language</w:t>
+      </w:r>
+    </w:p>
+    <w:p>
+      <w:pPr>
+        <w:rPr>
+          <w:rFonts w:hint="eastAsia"/>
+        </w:rPr>
+      </w:pPr>
+      <w:r>
+        <w:t xml:space="preserve">Backend: </w:t>
       </w:r>
       <w:r>
         <w:t>Java</w:t>
+      </w:r>
+      <w:r>
+        <w:t>, Spring Boot framework</w:t>
+      </w:r>
+    </w:p>
+    <w:p>
+      <w:r>
+        <w:t>Frontend: React</w:t>
       </w:r>
     </w:p>
     <w:p>

</xml_diff>

<commit_message>
doc: make a coverage and refine to match requirements
</commit_message>
<xml_diff>
--- a/document/hw1.docx
+++ b/document/hw1.docx
@@ -1,163 +1,574 @@
 
 <file path=word/document.xml><?xml version="1.0" encoding="utf-8"?>
-<w:document xmlns:wpc="http://schemas.microsoft.com/office/word/2010/wordprocessingCanvas" xmlns:cx="http://schemas.microsoft.com/office/drawing/2014/chartex" xmlns:cx1="http://schemas.microsoft.com/office/drawing/2015/9/8/chartex" xmlns:cx2="http://schemas.microsoft.com/office/drawing/2015/10/21/chartex" xmlns:cx3="http://schemas.microsoft.com/office/drawing/2016/5/9/chartex" xmlns:cx4="http://schemas.microsoft.com/office/drawing/2016/5/10/chartex" xmlns:cx5="http://schemas.microsoft.com/office/drawing/2016/5/11/chartex" xmlns:cx6="http://schemas.microsoft.com/office/drawing/2016/5/12/chartex" xmlns:cx7="http://schemas.microsoft.com/office/drawing/2016/5/13/chartex" xmlns:cx8="http://schemas.microsoft.com/office/drawing/2016/5/14/chartex" xmlns:mc="http://schemas.openxmlformats.org/markup-compatibility/2006" xmlns:aink="http://schemas.microsoft.com/office/drawing/2016/ink" xmlns:am3d="http://schemas.microsoft.com/office/drawing/2017/model3d" xmlns:o="urn:schemas-microsoft-com:office:office" xmlns:oel="http://schemas.microsoft.com/office/2019/extlst" xmlns:r="http://schemas.openxmlformats.org/officeDocument/2006/relationships" xmlns:m="http://schemas.openxmlformats.org/officeDocument/2006/math" xmlns:v="urn:schemas-microsoft-com:vml" xmlns:wp14="http://schemas.microsoft.com/office/word/2010/wordprocessingDrawing" xmlns:wp="http://schemas.openxmlformats.org/drawingml/2006/wordprocessingDrawing" xmlns:w10="urn:schemas-microsoft-com:office:word" xmlns:w="http://schemas.openxmlformats.org/wordprocessingml/2006/main" xmlns:w14="http://schemas.microsoft.com/office/word/2010/wordml" xmlns:w15="http://schemas.microsoft.com/office/word/2012/wordml" xmlns:w16cex="http://schemas.microsoft.com/office/word/2018/wordml/cex" xmlns:w16cid="http://schemas.microsoft.com/office/word/2016/wordml/cid" xmlns:w16="http://schemas.microsoft.com/office/word/2018/wordml" xmlns:w16du="http://schemas.microsoft.com/office/word/2023/wordml/word16du" xmlns:w16sdtdh="http://schemas.microsoft.com/office/word/2020/wordml/sdtdatahash" xmlns:w16sdtfl="http://schemas.microsoft.com/office/word/2024/wordml/sdtformatlock" xmlns:w16se="http://schemas.microsoft.com/office/word/2015/wordml/symex" xmlns:wpg="http://schemas.microsoft.com/office/word/2010/wordprocessingGroup" xmlns:wpi="http://schemas.microsoft.com/office/word/2010/wordprocessingInk" xmlns:wne="http://schemas.microsoft.com/office/word/2006/wordml" xmlns:wps="http://schemas.microsoft.com/office/word/2010/wordprocessingShape" mc:Ignorable="w14 w15 w16se w16cid w16 w16cex w16sdtdh w16sdtfl w16du wp14">
+<w:document xmlns:wpc="http://schemas.microsoft.com/office/word/2010/wordprocessingCanvas" xmlns:cx="http://schemas.microsoft.com/office/drawing/2014/chartex" xmlns:cx1="http://schemas.microsoft.com/office/drawing/2015/9/8/chartex" xmlns:cx2="http://schemas.microsoft.com/office/drawing/2015/10/21/chartex" xmlns:cx3="http://schemas.microsoft.com/office/drawing/2016/5/9/chartex" xmlns:cx4="http://schemas.microsoft.com/office/drawing/2016/5/10/chartex" xmlns:cx5="http://schemas.microsoft.com/office/drawing/2016/5/11/chartex" xmlns:cx6="http://schemas.microsoft.com/office/drawing/2016/5/12/chartex" xmlns:cx7="http://schemas.microsoft.com/office/drawing/2016/5/13/chartex" xmlns:cx8="http://schemas.microsoft.com/office/drawing/2016/5/14/chartex" xmlns:mc="http://schemas.openxmlformats.org/markup-compatibility/2006" xmlns:aink="http://schemas.microsoft.com/office/drawing/2016/ink" xmlns:am3d="http://schemas.microsoft.com/office/drawing/2017/model3d" xmlns:o="urn:schemas-microsoft-com:office:office" xmlns:oel="http://schemas.microsoft.com/office/2019/extlst" xmlns:r="http://schemas.openxmlformats.org/officeDocument/2006/relationships" xmlns:m="http://schemas.openxmlformats.org/officeDocument/2006/math" xmlns:v="urn:schemas-microsoft-com:vml" xmlns:wp14="http://schemas.microsoft.com/office/word/2010/wordprocessingDrawing" xmlns:wp="http://schemas.openxmlformats.org/drawingml/2006/wordprocessingDrawing" xmlns:w10="urn:schemas-microsoft-com:office:word" xmlns:w="http://schemas.openxmlformats.org/wordprocessingml/2006/main" xmlns:w14="http://schemas.microsoft.com/office/word/2010/wordml" xmlns:w15="http://schemas.microsoft.com/office/word/2012/wordml" xmlns:w16cex="http://schemas.microsoft.com/office/word/2018/wordml/cex" xmlns:w16cid="http://schemas.microsoft.com/office/word/2016/wordml/cid" xmlns:w16="http://schemas.microsoft.com/office/word/2018/wordml" xmlns:w16sdtdh="http://schemas.microsoft.com/office/word/2020/wordml/sdtdatahash" xmlns:w16se="http://schemas.microsoft.com/office/word/2015/wordml/symex" xmlns:wpg="http://schemas.microsoft.com/office/word/2010/wordprocessingGroup" xmlns:wpi="http://schemas.microsoft.com/office/word/2010/wordprocessingInk" xmlns:wne="http://schemas.microsoft.com/office/word/2006/wordml" xmlns:wps="http://schemas.microsoft.com/office/word/2010/wordprocessingShape" mc:Ignorable="w14 w15 w16se w16cid w16 w16cex w16sdtdh wp14">
   <w:body>
     <w:p>
-      <w:r>
-        <w:rPr>
-          <w:rFonts w:hint="eastAsia"/>
-        </w:rPr>
-        <w:t>二手書平台</w:t>
-      </w:r>
-    </w:p>
-    <w:p>
-      <w:r>
-        <w:t>HW1</w:t>
-      </w:r>
-    </w:p>
-    <w:p>
-      <w:r>
-        <w:t xml:space="preserve">113598037 </w:t>
-      </w:r>
-      <w:r>
-        <w:rPr>
-          <w:rFonts w:hint="eastAsia"/>
-        </w:rPr>
-        <w:t>陳宥錡</w:t>
-      </w:r>
-    </w:p>
-    <w:p>
-      <w:r>
-        <w:t xml:space="preserve">114598003 </w:t>
-      </w:r>
-      <w:r>
-        <w:rPr>
-          <w:rFonts w:hint="eastAsia"/>
+      <w:pPr>
+        <w:jc w:val="center"/>
+        <w:rPr>
+          <w:rFonts w:ascii="Times New Roman" w:eastAsia="標楷體" w:hAnsi="Times New Roman" w:cs="Times New Roman"/>
+        </w:rPr>
+      </w:pPr>
+    </w:p>
+    <w:p>
+      <w:pPr>
+        <w:jc w:val="center"/>
+        <w:rPr>
+          <w:rFonts w:ascii="Times New Roman" w:eastAsia="標楷體" w:hAnsi="Times New Roman" w:cs="Times New Roman"/>
+        </w:rPr>
+      </w:pPr>
+    </w:p>
+    <w:p>
+      <w:pPr>
+        <w:jc w:val="center"/>
+        <w:rPr>
+          <w:rFonts w:ascii="Times New Roman" w:eastAsia="標楷體" w:hAnsi="Times New Roman" w:cs="Times New Roman"/>
+        </w:rPr>
+      </w:pPr>
+    </w:p>
+    <w:p>
+      <w:pPr>
+        <w:jc w:val="center"/>
+        <w:rPr>
+          <w:rFonts w:ascii="Times New Roman" w:eastAsia="標楷體" w:hAnsi="Times New Roman" w:cs="Times New Roman"/>
+          <w:b/>
+          <w:bCs/>
+          <w:sz w:val="40"/>
+          <w:szCs w:val="40"/>
+        </w:rPr>
+      </w:pPr>
+      <w:r>
+        <w:rPr>
+          <w:rFonts w:ascii="Times New Roman" w:eastAsia="標楷體" w:hAnsi="Times New Roman" w:cs="Times New Roman"/>
+          <w:b/>
+          <w:bCs/>
+          <w:sz w:val="40"/>
+          <w:szCs w:val="40"/>
+        </w:rPr>
+        <w:t>Object-Oriented Analysis and Design</w:t>
+      </w:r>
+    </w:p>
+    <w:p>
+      <w:pPr>
+        <w:jc w:val="center"/>
+        <w:rPr>
+          <w:rFonts w:ascii="Times New Roman" w:eastAsia="標楷體" w:hAnsi="Times New Roman" w:cs="Times New Roman"/>
+        </w:rPr>
+      </w:pPr>
+    </w:p>
+    <w:p>
+      <w:pPr>
+        <w:jc w:val="center"/>
+        <w:rPr>
+          <w:rFonts w:ascii="Times New Roman" w:eastAsia="標楷體" w:hAnsi="Times New Roman" w:cs="Times New Roman"/>
+        </w:rPr>
+      </w:pPr>
+    </w:p>
+    <w:p>
+      <w:pPr>
+        <w:jc w:val="center"/>
+        <w:rPr>
+          <w:rFonts w:ascii="Times New Roman" w:eastAsia="標楷體" w:hAnsi="Times New Roman" w:cs="Times New Roman"/>
+        </w:rPr>
+      </w:pPr>
+    </w:p>
+    <w:p>
+      <w:pPr>
+        <w:jc w:val="center"/>
+        <w:rPr>
+          <w:rFonts w:ascii="Times New Roman" w:eastAsia="標楷體" w:hAnsi="Times New Roman" w:cs="Times New Roman"/>
+          <w:b/>
+          <w:bCs/>
+          <w:sz w:val="52"/>
+          <w:szCs w:val="52"/>
+        </w:rPr>
+      </w:pPr>
+      <w:proofErr w:type="spellStart"/>
+      <w:proofErr w:type="gramStart"/>
+      <w:r>
+        <w:rPr>
+          <w:rFonts w:ascii="Times New Roman" w:eastAsia="標楷體" w:hAnsi="Times New Roman" w:cs="Times New Roman" w:hint="eastAsia"/>
+          <w:b/>
+          <w:bCs/>
+          <w:sz w:val="52"/>
+          <w:szCs w:val="52"/>
+        </w:rPr>
+        <w:t>Re:Book</w:t>
+      </w:r>
+      <w:proofErr w:type="spellEnd"/>
+      <w:proofErr w:type="gramEnd"/>
+    </w:p>
+    <w:p>
+      <w:pPr>
+        <w:jc w:val="center"/>
+        <w:rPr>
+          <w:rFonts w:ascii="Times New Roman" w:eastAsia="標楷體" w:hAnsi="Times New Roman" w:cs="Times New Roman"/>
+          <w:b/>
+          <w:bCs/>
+          <w:sz w:val="52"/>
+          <w:szCs w:val="52"/>
+        </w:rPr>
+      </w:pPr>
+      <w:r>
+        <w:rPr>
+          <w:rFonts w:ascii="Times New Roman" w:eastAsia="標楷體" w:hAnsi="Times New Roman" w:cs="Times New Roman"/>
+          <w:b/>
+          <w:bCs/>
+          <w:sz w:val="52"/>
+          <w:szCs w:val="52"/>
+        </w:rPr>
+        <w:t>Online Marketplace for Used Books</w:t>
+      </w:r>
+    </w:p>
+    <w:p>
+      <w:pPr>
+        <w:jc w:val="center"/>
+        <w:rPr>
+          <w:rFonts w:ascii="Times New Roman" w:eastAsia="標楷體" w:hAnsi="Times New Roman" w:cs="Times New Roman"/>
+        </w:rPr>
+      </w:pPr>
+    </w:p>
+    <w:p>
+      <w:pPr>
+        <w:jc w:val="center"/>
+        <w:rPr>
+          <w:rFonts w:ascii="Times New Roman" w:eastAsia="標楷體" w:hAnsi="Times New Roman" w:cs="Times New Roman"/>
+        </w:rPr>
+      </w:pPr>
+    </w:p>
+    <w:p>
+      <w:pPr>
+        <w:jc w:val="center"/>
+        <w:rPr>
+          <w:rFonts w:ascii="Times New Roman" w:eastAsia="標楷體" w:hAnsi="Times New Roman" w:cs="Times New Roman"/>
+          <w:b/>
+          <w:bCs/>
+          <w:sz w:val="40"/>
+          <w:szCs w:val="40"/>
+        </w:rPr>
+      </w:pPr>
+      <w:r>
+        <w:rPr>
+          <w:rFonts w:ascii="Times New Roman" w:eastAsia="標楷體" w:hAnsi="Times New Roman" w:cs="Times New Roman"/>
+          <w:b/>
+          <w:bCs/>
+          <w:sz w:val="40"/>
+          <w:szCs w:val="40"/>
+        </w:rPr>
+        <w:t>HW#1</w:t>
+      </w:r>
+    </w:p>
+    <w:p>
+      <w:pPr>
+        <w:jc w:val="center"/>
+        <w:rPr>
+          <w:rFonts w:ascii="Times New Roman" w:eastAsia="標楷體" w:hAnsi="Times New Roman" w:cs="Times New Roman"/>
+        </w:rPr>
+      </w:pPr>
+    </w:p>
+    <w:p>
+      <w:pPr>
+        <w:jc w:val="center"/>
+        <w:rPr>
+          <w:rFonts w:ascii="Times New Roman" w:eastAsia="標楷體" w:hAnsi="Times New Roman" w:cs="Times New Roman"/>
+        </w:rPr>
+      </w:pPr>
+    </w:p>
+    <w:p>
+      <w:pPr>
+        <w:jc w:val="center"/>
+        <w:rPr>
+          <w:rFonts w:ascii="Times New Roman" w:eastAsia="標楷體" w:hAnsi="Times New Roman" w:cs="Times New Roman"/>
+        </w:rPr>
+      </w:pPr>
+    </w:p>
+    <w:p>
+      <w:pPr>
+        <w:jc w:val="center"/>
+        <w:rPr>
+          <w:rFonts w:ascii="Times New Roman" w:eastAsia="標楷體" w:hAnsi="Times New Roman" w:cs="Times New Roman"/>
+          <w:sz w:val="40"/>
+          <w:szCs w:val="40"/>
+        </w:rPr>
+      </w:pPr>
+      <w:proofErr w:type="gramStart"/>
+      <w:r>
+        <w:rPr>
+          <w:rFonts w:ascii="Times New Roman" w:eastAsia="標楷體" w:hAnsi="Times New Roman" w:cs="Times New Roman"/>
+          <w:sz w:val="40"/>
+          <w:szCs w:val="40"/>
+        </w:rPr>
+        <w:t>資工碩</w:t>
+      </w:r>
+      <w:proofErr w:type="gramEnd"/>
+      <w:r>
+        <w:rPr>
+          <w:rFonts w:ascii="Times New Roman" w:eastAsia="標楷體" w:hAnsi="Times New Roman" w:cs="Times New Roman"/>
+          <w:sz w:val="40"/>
+          <w:szCs w:val="40"/>
+        </w:rPr>
+        <w:t>二</w:t>
+      </w:r>
+      <w:r>
+        <w:rPr>
+          <w:rFonts w:ascii="Times New Roman" w:eastAsia="標楷體" w:hAnsi="Times New Roman" w:cs="Times New Roman"/>
+          <w:sz w:val="40"/>
+          <w:szCs w:val="40"/>
+        </w:rPr>
+        <w:t xml:space="preserve"> 113598037 </w:t>
+      </w:r>
+      <w:r>
+        <w:rPr>
+          <w:rFonts w:ascii="Times New Roman" w:eastAsia="標楷體" w:hAnsi="Times New Roman" w:cs="Times New Roman"/>
+          <w:sz w:val="40"/>
+          <w:szCs w:val="40"/>
+        </w:rPr>
+        <w:t>陳</w:t>
+      </w:r>
+      <w:proofErr w:type="gramStart"/>
+      <w:r>
+        <w:rPr>
+          <w:rFonts w:ascii="Times New Roman" w:eastAsia="標楷體" w:hAnsi="Times New Roman" w:cs="Times New Roman"/>
+          <w:sz w:val="40"/>
+          <w:szCs w:val="40"/>
+        </w:rPr>
+        <w:t>宥錡</w:t>
+      </w:r>
+      <w:proofErr w:type="gramEnd"/>
+    </w:p>
+    <w:p>
+      <w:pPr>
+        <w:jc w:val="center"/>
+        <w:rPr>
+          <w:rFonts w:ascii="Times New Roman" w:eastAsia="標楷體" w:hAnsi="Times New Roman" w:cs="Times New Roman"/>
+          <w:sz w:val="40"/>
+          <w:szCs w:val="40"/>
+        </w:rPr>
+      </w:pPr>
+      <w:r>
+        <w:rPr>
+          <w:rFonts w:ascii="Times New Roman" w:eastAsia="標楷體" w:hAnsi="Times New Roman" w:cs="Times New Roman"/>
+          <w:sz w:val="40"/>
+          <w:szCs w:val="40"/>
+        </w:rPr>
+        <w:t>資工碩</w:t>
+      </w:r>
+      <w:proofErr w:type="gramStart"/>
+      <w:r>
+        <w:rPr>
+          <w:rFonts w:ascii="Times New Roman" w:eastAsia="標楷體" w:hAnsi="Times New Roman" w:cs="Times New Roman"/>
+          <w:sz w:val="40"/>
+          <w:szCs w:val="40"/>
+        </w:rPr>
+        <w:t>一</w:t>
+      </w:r>
+      <w:proofErr w:type="gramEnd"/>
+      <w:r>
+        <w:rPr>
+          <w:rFonts w:ascii="Times New Roman" w:eastAsia="標楷體" w:hAnsi="Times New Roman" w:cs="Times New Roman"/>
+          <w:sz w:val="40"/>
+          <w:szCs w:val="40"/>
+        </w:rPr>
+        <w:t xml:space="preserve"> 114598003 </w:t>
+      </w:r>
+      <w:r>
+        <w:rPr>
+          <w:rFonts w:ascii="Times New Roman" w:eastAsia="標楷體" w:hAnsi="Times New Roman" w:cs="Times New Roman"/>
+          <w:sz w:val="40"/>
+          <w:szCs w:val="40"/>
         </w:rPr>
         <w:t>許芷菱</w:t>
       </w:r>
     </w:p>
     <w:p>
-      <w:r>
+      <w:pPr>
+        <w:jc w:val="center"/>
+        <w:rPr>
+          <w:rFonts w:ascii="Times New Roman" w:eastAsia="標楷體" w:hAnsi="Times New Roman" w:cs="Times New Roman"/>
+        </w:rPr>
+      </w:pPr>
+    </w:p>
+    <w:p>
+      <w:pPr>
+        <w:jc w:val="center"/>
+        <w:rPr>
+          <w:rFonts w:ascii="Times New Roman" w:eastAsia="標楷體" w:hAnsi="Times New Roman" w:cs="Times New Roman"/>
+        </w:rPr>
+      </w:pPr>
+    </w:p>
+    <w:p>
+      <w:pPr>
+        <w:jc w:val="center"/>
+        <w:rPr>
+          <w:rFonts w:ascii="Times New Roman" w:eastAsia="標楷體" w:hAnsi="Times New Roman" w:cs="Times New Roman"/>
+        </w:rPr>
+      </w:pPr>
+    </w:p>
+    <w:p>
+      <w:pPr>
+        <w:widowControl/>
+        <w:jc w:val="center"/>
+        <w:rPr>
+          <w:rFonts w:ascii="Times New Roman" w:eastAsia="標楷體" w:hAnsi="Times New Roman" w:cs="Times New Roman"/>
+        </w:rPr>
+      </w:pPr>
+      <w:r>
+        <w:rPr>
+          <w:rFonts w:ascii="Times New Roman" w:eastAsia="標楷體" w:hAnsi="Times New Roman" w:cs="Times New Roman"/>
+        </w:rPr>
+        <w:br w:type="page"/>
+      </w:r>
+    </w:p>
+    <w:p>
+      <w:pPr>
+        <w:rPr>
+          <w:rFonts w:ascii="Times New Roman" w:eastAsia="標楷體" w:hAnsi="Times New Roman" w:cs="Times New Roman"/>
+          <w:b/>
+          <w:bCs/>
+          <w:sz w:val="28"/>
+          <w:szCs w:val="28"/>
+        </w:rPr>
+      </w:pPr>
+      <w:r>
+        <w:rPr>
+          <w:rFonts w:ascii="Times New Roman" w:eastAsia="標楷體" w:hAnsi="Times New Roman" w:cs="Times New Roman"/>
+          <w:b/>
+          <w:bCs/>
+          <w:sz w:val="28"/>
+          <w:szCs w:val="28"/>
+        </w:rPr>
+        <w:lastRenderedPageBreak/>
         <w:t>Problem Statement</w:t>
       </w:r>
     </w:p>
     <w:p>
       <w:pPr>
         <w:rPr>
-          <w:rFonts w:hint="eastAsia"/>
+          <w:rFonts w:ascii="Times New Roman" w:eastAsia="標楷體" w:hAnsi="Times New Roman" w:cs="Times New Roman"/>
         </w:rPr>
       </w:pPr>
       <w:proofErr w:type="spellStart"/>
       <w:r>
         <w:rPr>
-          <w:rFonts w:hint="eastAsia"/>
+          <w:rFonts w:ascii="Times New Roman" w:eastAsia="標楷體" w:hAnsi="Times New Roman" w:cs="Times New Roman"/>
         </w:rPr>
         <w:t>Re:Book</w:t>
       </w:r>
       <w:proofErr w:type="spellEnd"/>
       <w:r>
         <w:rPr>
-          <w:rFonts w:hint="eastAsia"/>
+          <w:rFonts w:ascii="Times New Roman" w:eastAsia="標楷體" w:hAnsi="Times New Roman" w:cs="Times New Roman"/>
         </w:rPr>
         <w:t>：賦予知識第二次生命</w:t>
       </w:r>
     </w:p>
     <w:p>
-      <w:r>
-        <w:rPr>
-          <w:rFonts w:hint="eastAsia"/>
-        </w:rPr>
-        <w:t>每個學期，學生們都會為了課程購入大量的專業教科書或英文原文書。雖然這些書在學期中不可或缺，但往往在期末考結束後，便被遺忘在書架上某個佈滿灰塵的角落。這些本該繼續啟發他人的知識結晶，經常在畢業大掃除或搬家前被冷落。雖然有些學生會將書贈與熟識的學弟妹，但更多寶貴的資源就在無形中被浪費了。</w:t>
-      </w:r>
-    </w:p>
-    <w:p>
+      <w:pPr>
+        <w:rPr>
+          <w:rFonts w:ascii="Times New Roman" w:eastAsia="標楷體" w:hAnsi="Times New Roman" w:cs="Times New Roman" w:hint="eastAsia"/>
+        </w:rPr>
+      </w:pPr>
       <w:proofErr w:type="spellStart"/>
       <w:r>
         <w:rPr>
-          <w:rFonts w:hint="eastAsia"/>
+          <w:rFonts w:ascii="Times New Roman" w:eastAsia="標楷體" w:hAnsi="Times New Roman" w:cs="Times New Roman" w:hint="eastAsia"/>
         </w:rPr>
         <w:t>Re:Book</w:t>
       </w:r>
       <w:proofErr w:type="spellEnd"/>
       <w:r>
         <w:rPr>
-          <w:rFonts w:hint="eastAsia"/>
+          <w:rFonts w:ascii="Times New Roman" w:eastAsia="標楷體" w:hAnsi="Times New Roman" w:cs="Times New Roman" w:hint="eastAsia"/>
         </w:rPr>
         <w:t xml:space="preserve"> </w:t>
       </w:r>
       <w:r>
         <w:rPr>
-          <w:rFonts w:hint="eastAsia"/>
-        </w:rPr>
-        <w:t>是一款專為學生與求知者打造的應用程式，旨在解決資源停滯與學術教材成本過高的問題。它在校園社群與學生網路群組之間架起橋樑，特別是在學期交替之際，當教材需求量最高的時候。我們深信這個平台是必要的，因為每一本書都值得擁有尋找下一個生命意義的機會，而不是淪為廢棄物。</w:t>
-      </w:r>
-    </w:p>
-    <w:p>
+          <w:rFonts w:ascii="Times New Roman" w:eastAsia="標楷體" w:hAnsi="Times New Roman" w:cs="Times New Roman" w:hint="eastAsia"/>
+        </w:rPr>
+        <w:t>是一款專為大學生</w:t>
+      </w:r>
+      <w:r>
+        <w:rPr>
+          <w:rFonts w:ascii="Times New Roman" w:eastAsia="標楷體" w:hAnsi="Times New Roman" w:cs="Times New Roman" w:hint="eastAsia"/>
+        </w:rPr>
+        <w:t>、</w:t>
+      </w:r>
+      <w:r>
+        <w:rPr>
+          <w:rFonts w:ascii="Times New Roman" w:eastAsia="標楷體" w:hAnsi="Times New Roman" w:cs="Times New Roman" w:hint="eastAsia"/>
+        </w:rPr>
+        <w:t>研究生與自學者打造的應用程式，旨在解決資源浪費與學術教材成本過高的問題。每逢學期交替、教材需求達到高峰之際，本平台透過行動裝置與網頁介面，串連校園社群與學生網路群組，為二手書流通建立更有效率的媒合橋樑。我們深信此平台的存在具有其必要性，因為每一本書都值得擁有延續價值的機會，而不應被遺忘或淪為廢棄物。</w:t>
+      </w:r>
+    </w:p>
+    <w:p>
+      <w:pPr>
+        <w:rPr>
+          <w:rFonts w:ascii="Times New Roman" w:eastAsia="標楷體" w:hAnsi="Times New Roman" w:cs="Times New Roman"/>
+        </w:rPr>
+      </w:pPr>
       <w:proofErr w:type="spellStart"/>
       <w:r>
+        <w:rPr>
+          <w:rFonts w:ascii="Times New Roman" w:eastAsia="標楷體" w:hAnsi="Times New Roman" w:cs="Times New Roman" w:hint="eastAsia"/>
+        </w:rPr>
         <w:t>Re:Book</w:t>
       </w:r>
       <w:proofErr w:type="spellEnd"/>
       <w:r>
         <w:rPr>
-          <w:rFonts w:hint="eastAsia"/>
-        </w:rPr>
-        <w:t>透過直觀的交換系統為二手書注入新生命。賣家可以輸入書名、作者、出版社或</w:t>
-      </w:r>
-      <w:r>
-        <w:rPr>
-          <w:rFonts w:hint="eastAsia"/>
+          <w:rFonts w:ascii="Times New Roman" w:eastAsia="標楷體" w:hAnsi="Times New Roman" w:cs="Times New Roman" w:hint="eastAsia"/>
+        </w:rPr>
+        <w:t xml:space="preserve"> </w:t>
+      </w:r>
+      <w:r>
+        <w:rPr>
+          <w:rFonts w:ascii="Times New Roman" w:eastAsia="標楷體" w:hAnsi="Times New Roman" w:cs="Times New Roman" w:hint="eastAsia"/>
+        </w:rPr>
+        <w:t>透過直觀且易於操作的交換機制，為二手書注入新的生命。賣家可輸入書名、作者、出版社或</w:t>
+      </w:r>
+      <w:r>
+        <w:rPr>
+          <w:rFonts w:ascii="Times New Roman" w:eastAsia="標楷體" w:hAnsi="Times New Roman" w:cs="Times New Roman" w:hint="eastAsia"/>
         </w:rPr>
         <w:t xml:space="preserve"> ISBN </w:t>
       </w:r>
       <w:r>
         <w:rPr>
-          <w:rFonts w:hint="eastAsia"/>
-        </w:rPr>
-        <w:t>來上架書籍，讓系統對現有知識進行分類。為了尊重書本的價值，賣家可以設定期望價格，並分享書籍狀況的照片或故事。潛在買家則能利用搜尋與篩選功能找到下一本必讀讀物。最後，</w:t>
-      </w:r>
-      <w:r>
-        <w:rPr>
-          <w:rFonts w:hint="eastAsia"/>
-        </w:rPr>
-        <w:t>提供</w:t>
-      </w:r>
-      <w:r>
-        <w:rPr>
-          <w:rFonts w:hint="eastAsia"/>
-        </w:rPr>
-        <w:t>私訊功能讓使用者能協商最終價格並協調交付方式，確保知識的傳遞是具有人情味且順暢的。</w:t>
-      </w:r>
-    </w:p>
-    <w:p>
-      <w:r>
+          <w:rFonts w:ascii="Times New Roman" w:eastAsia="標楷體" w:hAnsi="Times New Roman" w:cs="Times New Roman" w:hint="eastAsia"/>
+        </w:rPr>
+        <w:t>上架書籍，系統將自動進行分類與整理。為體現對書本價值的尊重，賣家可設定期望售價，並上傳書</w:t>
+      </w:r>
+      <w:proofErr w:type="gramStart"/>
+      <w:r>
+        <w:rPr>
+          <w:rFonts w:ascii="Times New Roman" w:eastAsia="標楷體" w:hAnsi="Times New Roman" w:cs="Times New Roman" w:hint="eastAsia"/>
+        </w:rPr>
+        <w:t>況</w:t>
+      </w:r>
+      <w:proofErr w:type="gramEnd"/>
+      <w:r>
+        <w:rPr>
+          <w:rFonts w:ascii="Times New Roman" w:eastAsia="標楷體" w:hAnsi="Times New Roman" w:cs="Times New Roman" w:hint="eastAsia"/>
+        </w:rPr>
+        <w:t>照片或分享使用心得。潛在買家則可透過搜尋與篩選功能，快速找到所需書籍。平台同時</w:t>
+      </w:r>
+      <w:proofErr w:type="gramStart"/>
+      <w:r>
+        <w:rPr>
+          <w:rFonts w:ascii="Times New Roman" w:eastAsia="標楷體" w:hAnsi="Times New Roman" w:cs="Times New Roman" w:hint="eastAsia"/>
+        </w:rPr>
+        <w:t>提供私訊機制</w:t>
+      </w:r>
+      <w:proofErr w:type="gramEnd"/>
+      <w:r>
+        <w:rPr>
+          <w:rFonts w:ascii="Times New Roman" w:eastAsia="標楷體" w:hAnsi="Times New Roman" w:cs="Times New Roman" w:hint="eastAsia"/>
+        </w:rPr>
+        <w:t>，讓雙方協商最終價格與交付方式，確保知識的傳遞過程既順暢高效，也保有人與人之間的溫度。</w:t>
+      </w:r>
+    </w:p>
+    <w:p>
+      <w:pPr>
+        <w:rPr>
+          <w:rFonts w:ascii="Times New Roman" w:eastAsia="標楷體" w:hAnsi="Times New Roman" w:cs="Times New Roman" w:hint="eastAsia"/>
+        </w:rPr>
+      </w:pPr>
+    </w:p>
+    <w:p>
+      <w:pPr>
+        <w:rPr>
+          <w:rFonts w:ascii="Times New Roman" w:eastAsia="標楷體" w:hAnsi="Times New Roman" w:cs="Times New Roman"/>
+          <w:b/>
+          <w:bCs/>
+          <w:sz w:val="28"/>
+          <w:szCs w:val="28"/>
+        </w:rPr>
+      </w:pPr>
+      <w:r>
+        <w:rPr>
+          <w:rFonts w:ascii="Times New Roman" w:eastAsia="標楷體" w:hAnsi="Times New Roman" w:cs="Times New Roman"/>
+          <w:b/>
+          <w:bCs/>
+          <w:sz w:val="28"/>
+          <w:szCs w:val="28"/>
+        </w:rPr>
         <w:t>The Development Language</w:t>
       </w:r>
     </w:p>
     <w:p>
       <w:pPr>
-        <w:rPr>
-          <w:rFonts w:hint="eastAsia"/>
-        </w:rPr>
-      </w:pPr>
-      <w:r>
+        <w:pStyle w:val="a9"/>
+        <w:numPr>
+          <w:ilvl w:val="0"/>
+          <w:numId w:val="1"/>
+        </w:numPr>
+        <w:rPr>
+          <w:rFonts w:ascii="Times New Roman" w:eastAsia="標楷體" w:hAnsi="Times New Roman" w:cs="Times New Roman"/>
+        </w:rPr>
+      </w:pPr>
+      <w:r>
+        <w:rPr>
+          <w:rFonts w:ascii="Times New Roman" w:eastAsia="標楷體" w:hAnsi="Times New Roman" w:cs="Times New Roman"/>
+        </w:rPr>
         <w:t xml:space="preserve">Backend: </w:t>
       </w:r>
       <w:r>
+        <w:rPr>
+          <w:rFonts w:ascii="Times New Roman" w:eastAsia="標楷體" w:hAnsi="Times New Roman" w:cs="Times New Roman"/>
+        </w:rPr>
         <w:t>Java</w:t>
       </w:r>
       <w:r>
+        <w:rPr>
+          <w:rFonts w:ascii="Times New Roman" w:eastAsia="標楷體" w:hAnsi="Times New Roman" w:cs="Times New Roman"/>
+        </w:rPr>
         <w:t>, Spring Boot framework</w:t>
       </w:r>
     </w:p>
     <w:p>
-      <w:r>
+      <w:pPr>
+        <w:pStyle w:val="a9"/>
+        <w:numPr>
+          <w:ilvl w:val="0"/>
+          <w:numId w:val="1"/>
+        </w:numPr>
+        <w:rPr>
+          <w:rFonts w:ascii="Times New Roman" w:eastAsia="標楷體" w:hAnsi="Times New Roman" w:cs="Times New Roman"/>
+        </w:rPr>
+      </w:pPr>
+      <w:r>
+        <w:rPr>
+          <w:rFonts w:ascii="Times New Roman" w:eastAsia="標楷體" w:hAnsi="Times New Roman" w:cs="Times New Roman"/>
+        </w:rPr>
         <w:t>Frontend: React</w:t>
       </w:r>
     </w:p>
     <w:p>
-      <w:r>
+      <w:pPr>
+        <w:rPr>
+          <w:rFonts w:ascii="Times New Roman" w:eastAsia="標楷體" w:hAnsi="Times New Roman" w:cs="Times New Roman"/>
+        </w:rPr>
+      </w:pPr>
+    </w:p>
+    <w:p>
+      <w:pPr>
+        <w:rPr>
+          <w:rFonts w:ascii="Times New Roman" w:eastAsia="標楷體" w:hAnsi="Times New Roman" w:cs="Times New Roman"/>
+          <w:b/>
+          <w:bCs/>
+          <w:sz w:val="28"/>
+          <w:szCs w:val="28"/>
+        </w:rPr>
+      </w:pPr>
+      <w:r>
+        <w:rPr>
+          <w:rFonts w:ascii="Times New Roman" w:eastAsia="標楷體" w:hAnsi="Times New Roman" w:cs="Times New Roman"/>
+          <w:b/>
+          <w:bCs/>
+          <w:sz w:val="28"/>
+          <w:szCs w:val="28"/>
+        </w:rPr>
         <w:t>Measurement</w:t>
       </w:r>
     </w:p>
@@ -171,8 +582,129 @@
 </w:document>
 </file>
 
+<file path=word/numbering.xml><?xml version="1.0" encoding="utf-8"?>
+<w:numbering xmlns:wpc="http://schemas.microsoft.com/office/word/2010/wordprocessingCanvas" xmlns:cx="http://schemas.microsoft.com/office/drawing/2014/chartex" xmlns:cx1="http://schemas.microsoft.com/office/drawing/2015/9/8/chartex" xmlns:cx2="http://schemas.microsoft.com/office/drawing/2015/10/21/chartex" xmlns:cx3="http://schemas.microsoft.com/office/drawing/2016/5/9/chartex" xmlns:cx4="http://schemas.microsoft.com/office/drawing/2016/5/10/chartex" xmlns:cx5="http://schemas.microsoft.com/office/drawing/2016/5/11/chartex" xmlns:cx6="http://schemas.microsoft.com/office/drawing/2016/5/12/chartex" xmlns:cx7="http://schemas.microsoft.com/office/drawing/2016/5/13/chartex" xmlns:cx8="http://schemas.microsoft.com/office/drawing/2016/5/14/chartex" xmlns:mc="http://schemas.openxmlformats.org/markup-compatibility/2006" xmlns:aink="http://schemas.microsoft.com/office/drawing/2016/ink" xmlns:am3d="http://schemas.microsoft.com/office/drawing/2017/model3d" xmlns:o="urn:schemas-microsoft-com:office:office" xmlns:oel="http://schemas.microsoft.com/office/2019/extlst" xmlns:r="http://schemas.openxmlformats.org/officeDocument/2006/relationships" xmlns:m="http://schemas.openxmlformats.org/officeDocument/2006/math" xmlns:v="urn:schemas-microsoft-com:vml" xmlns:wp14="http://schemas.microsoft.com/office/word/2010/wordprocessingDrawing" xmlns:wp="http://schemas.openxmlformats.org/drawingml/2006/wordprocessingDrawing" xmlns:w10="urn:schemas-microsoft-com:office:word" xmlns:w="http://schemas.openxmlformats.org/wordprocessingml/2006/main" xmlns:w14="http://schemas.microsoft.com/office/word/2010/wordml" xmlns:w15="http://schemas.microsoft.com/office/word/2012/wordml" xmlns:w16cex="http://schemas.microsoft.com/office/word/2018/wordml/cex" xmlns:w16cid="http://schemas.microsoft.com/office/word/2016/wordml/cid" xmlns:w16="http://schemas.microsoft.com/office/word/2018/wordml" xmlns:w16sdtdh="http://schemas.microsoft.com/office/word/2020/wordml/sdtdatahash" xmlns:w16se="http://schemas.microsoft.com/office/word/2015/wordml/symex" xmlns:wpg="http://schemas.microsoft.com/office/word/2010/wordprocessingGroup" xmlns:wpi="http://schemas.microsoft.com/office/word/2010/wordprocessingInk" xmlns:wne="http://schemas.microsoft.com/office/word/2006/wordml" xmlns:wps="http://schemas.microsoft.com/office/word/2010/wordprocessingShape" mc:Ignorable="w14 w15 w16se w16cid w16 w16cex w16sdtdh wp14">
+  <w:abstractNum w:abstractNumId="0" w15:restartNumberingAfterBreak="0">
+    <w:nsid w:val="4B030739"/>
+    <w:multiLevelType w:val="hybridMultilevel"/>
+    <w:tmpl w:val="67E4FD68"/>
+    <w:lvl w:ilvl="0" w:tplc="FB7AFAA2">
+      <w:start w:val="1"/>
+      <w:numFmt w:val="bullet"/>
+      <w:lvlText w:val=""/>
+      <w:lvlJc w:val="left"/>
+      <w:pPr>
+        <w:ind w:left="480" w:hanging="480"/>
+      </w:pPr>
+      <w:rPr>
+        <w:rFonts w:ascii="Wingdings" w:hAnsi="Wingdings" w:hint="default"/>
+      </w:rPr>
+    </w:lvl>
+    <w:lvl w:ilvl="1" w:tplc="04090003" w:tentative="1">
+      <w:start w:val="1"/>
+      <w:numFmt w:val="bullet"/>
+      <w:lvlText w:val=""/>
+      <w:lvlJc w:val="left"/>
+      <w:pPr>
+        <w:ind w:left="960" w:hanging="480"/>
+      </w:pPr>
+      <w:rPr>
+        <w:rFonts w:ascii="Wingdings" w:hAnsi="Wingdings" w:hint="default"/>
+      </w:rPr>
+    </w:lvl>
+    <w:lvl w:ilvl="2" w:tplc="04090005" w:tentative="1">
+      <w:start w:val="1"/>
+      <w:numFmt w:val="bullet"/>
+      <w:lvlText w:val=""/>
+      <w:lvlJc w:val="left"/>
+      <w:pPr>
+        <w:ind w:left="1440" w:hanging="480"/>
+      </w:pPr>
+      <w:rPr>
+        <w:rFonts w:ascii="Wingdings" w:hAnsi="Wingdings" w:hint="default"/>
+      </w:rPr>
+    </w:lvl>
+    <w:lvl w:ilvl="3" w:tplc="04090001" w:tentative="1">
+      <w:start w:val="1"/>
+      <w:numFmt w:val="bullet"/>
+      <w:lvlText w:val=""/>
+      <w:lvlJc w:val="left"/>
+      <w:pPr>
+        <w:ind w:left="1920" w:hanging="480"/>
+      </w:pPr>
+      <w:rPr>
+        <w:rFonts w:ascii="Wingdings" w:hAnsi="Wingdings" w:hint="default"/>
+      </w:rPr>
+    </w:lvl>
+    <w:lvl w:ilvl="4" w:tplc="04090003" w:tentative="1">
+      <w:start w:val="1"/>
+      <w:numFmt w:val="bullet"/>
+      <w:lvlText w:val=""/>
+      <w:lvlJc w:val="left"/>
+      <w:pPr>
+        <w:ind w:left="2400" w:hanging="480"/>
+      </w:pPr>
+      <w:rPr>
+        <w:rFonts w:ascii="Wingdings" w:hAnsi="Wingdings" w:hint="default"/>
+      </w:rPr>
+    </w:lvl>
+    <w:lvl w:ilvl="5" w:tplc="04090005" w:tentative="1">
+      <w:start w:val="1"/>
+      <w:numFmt w:val="bullet"/>
+      <w:lvlText w:val=""/>
+      <w:lvlJc w:val="left"/>
+      <w:pPr>
+        <w:ind w:left="2880" w:hanging="480"/>
+      </w:pPr>
+      <w:rPr>
+        <w:rFonts w:ascii="Wingdings" w:hAnsi="Wingdings" w:hint="default"/>
+      </w:rPr>
+    </w:lvl>
+    <w:lvl w:ilvl="6" w:tplc="04090001" w:tentative="1">
+      <w:start w:val="1"/>
+      <w:numFmt w:val="bullet"/>
+      <w:lvlText w:val=""/>
+      <w:lvlJc w:val="left"/>
+      <w:pPr>
+        <w:ind w:left="3360" w:hanging="480"/>
+      </w:pPr>
+      <w:rPr>
+        <w:rFonts w:ascii="Wingdings" w:hAnsi="Wingdings" w:hint="default"/>
+      </w:rPr>
+    </w:lvl>
+    <w:lvl w:ilvl="7" w:tplc="04090003" w:tentative="1">
+      <w:start w:val="1"/>
+      <w:numFmt w:val="bullet"/>
+      <w:lvlText w:val=""/>
+      <w:lvlJc w:val="left"/>
+      <w:pPr>
+        <w:ind w:left="3840" w:hanging="480"/>
+      </w:pPr>
+      <w:rPr>
+        <w:rFonts w:ascii="Wingdings" w:hAnsi="Wingdings" w:hint="default"/>
+      </w:rPr>
+    </w:lvl>
+    <w:lvl w:ilvl="8" w:tplc="04090005" w:tentative="1">
+      <w:start w:val="1"/>
+      <w:numFmt w:val="bullet"/>
+      <w:lvlText w:val=""/>
+      <w:lvlJc w:val="left"/>
+      <w:pPr>
+        <w:ind w:left="4320" w:hanging="480"/>
+      </w:pPr>
+      <w:rPr>
+        <w:rFonts w:ascii="Wingdings" w:hAnsi="Wingdings" w:hint="default"/>
+      </w:rPr>
+    </w:lvl>
+  </w:abstractNum>
+  <w:num w:numId="1" w16cid:durableId="1101150216">
+    <w:abstractNumId w:val="0"/>
+  </w:num>
+</w:numbering>
+</file>
+
 <file path=word/styles.xml><?xml version="1.0" encoding="utf-8"?>
-<w:styles xmlns:mc="http://schemas.openxmlformats.org/markup-compatibility/2006" xmlns:r="http://schemas.openxmlformats.org/officeDocument/2006/relationships" xmlns:w="http://schemas.openxmlformats.org/wordprocessingml/2006/main" xmlns:w14="http://schemas.microsoft.com/office/word/2010/wordml" xmlns:w15="http://schemas.microsoft.com/office/word/2012/wordml" xmlns:w16cex="http://schemas.microsoft.com/office/word/2018/wordml/cex" xmlns:w16cid="http://schemas.microsoft.com/office/word/2016/wordml/cid" xmlns:w16="http://schemas.microsoft.com/office/word/2018/wordml" xmlns:w16du="http://schemas.microsoft.com/office/word/2023/wordml/word16du" xmlns:w16sdtdh="http://schemas.microsoft.com/office/word/2020/wordml/sdtdatahash" xmlns:w16sdtfl="http://schemas.microsoft.com/office/word/2024/wordml/sdtformatlock" xmlns:w16se="http://schemas.microsoft.com/office/word/2015/wordml/symex" mc:Ignorable="w14 w15 w16se w16cid w16 w16cex w16sdtdh w16sdtfl w16du">
+<w:styles xmlns:mc="http://schemas.openxmlformats.org/markup-compatibility/2006" xmlns:r="http://schemas.openxmlformats.org/officeDocument/2006/relationships" xmlns:w="http://schemas.openxmlformats.org/wordprocessingml/2006/main" xmlns:w14="http://schemas.microsoft.com/office/word/2010/wordml" xmlns:w15="http://schemas.microsoft.com/office/word/2012/wordml" xmlns:w16cex="http://schemas.microsoft.com/office/word/2018/wordml/cex" xmlns:w16cid="http://schemas.microsoft.com/office/word/2016/wordml/cid" xmlns:w16="http://schemas.microsoft.com/office/word/2018/wordml" xmlns:w16sdtdh="http://schemas.microsoft.com/office/word/2020/wordml/sdtdatahash" xmlns:w16se="http://schemas.microsoft.com/office/word/2015/wordml/symex" mc:Ignorable="w14 w15 w16se w16cid w16 w16cex w16sdtdh">
   <w:docDefaults>
     <w:rPrDefault>
       <w:rPr>

</xml_diff>